<commit_message>
Singapore resume: map strengths and bullets one-to-one to JD duties, conditions and bonus items
Co-authored-by: nancyx461-art <nancyx461-art@users.noreply.github.com>
</commit_message>
<xml_diff>
--- a/resume/许增楠-医药专家网络开发-新加坡驻外.docx
+++ b/resume/许增楠-医药专家网络开发-新加坡驻外.docx
@@ -330,7 +330,7 @@
           <w:color w:val="262626"/>
           <w:sz w:val="19"/>
         </w:rPr>
-        <w:t xml:space="preserve">临床专家开发与维护　</w:t>
+        <w:t xml:space="preserve">专家开发与维护　</w:t>
       </w:r>
       <w:r>
         <w:rPr>
@@ -339,7 +339,7 @@
           <w:color w:val="262626"/>
           <w:sz w:val="19"/>
         </w:rPr>
-        <w:t>强生期间围绕能量外科与微创外科临床专家开展工作，策划并落地 10+ 场学术活动，负责卫星会与科室会宣讲；渠道项目中直接对接副院长、科主任，完成 4 家医院准入、8 个产品入院。</w:t>
+        <w:t>强生期间围绕能量外科与微创外科核心科室梳理并持续拓展专家名单，策划落地 10+ 场学术活动，负责卫星会与科室会宣讲；渠道项目中直接对接副院长、科主任，从零完成 4 家医院准入、8 个产品入院。</w:t>
       </w:r>
     </w:p>
     <w:p>
@@ -368,7 +368,7 @@
           <w:color w:val="262626"/>
           <w:sz w:val="19"/>
         </w:rPr>
-        <w:t xml:space="preserve">外企药企与器械背景　</w:t>
+        <w:t xml:space="preserve">医药背景与专业对话　</w:t>
       </w:r>
       <w:r>
         <w:rPr>
@@ -377,7 +377,7 @@
           <w:color w:val="262626"/>
           <w:sz w:val="19"/>
         </w:rPr>
-        <w:t>本科修读中药学、药理学等医药课程；强生医疗 1.5 年一线销售培训生，罗氏制药区域市场部实习；入职培训系统学习解剖学与手术术式，能与临床医生就术式和产品应用场景专业对话。</w:t>
+        <w:t>本科修读中药学、药理学等医药课程，硕士聚焦医药营销；强生医疗 1.5 年一线销售，罗氏制药市场部实习；入职培训系统学习解剖学与手术术式，能与临床医生就术式和产品应用场景专业对话。</w:t>
       </w:r>
     </w:p>
     <w:p>
@@ -406,7 +406,7 @@
           <w:color w:val="262626"/>
           <w:sz w:val="19"/>
         </w:rPr>
-        <w:t xml:space="preserve">跨境医疗与项目推进　</w:t>
+        <w:t xml:space="preserve">项目推进与数据分析　</w:t>
       </w:r>
       <w:r>
         <w:rPr>
@@ -415,7 +415,7 @@
           <w:color w:val="262626"/>
           <w:sz w:val="19"/>
         </w:rPr>
-        <w:t>带领团队与 4 家私立医院洽谈跨境医疗合作，建立 5 家合作渠道商；习惯按节点推进项目，协调内外部资源落地。</w:t>
+        <w:t>带领团队与 4 家私立医院洽谈跨境医疗合作、建立 5 家合作渠道商；罗氏实习期间汇总专家反馈与市场数据输出月报，口腔医院战略项目中搭建盈亏平衡与客流分析模型；熟练使用 Excel、SPSS，习惯用数据和结果说话。</w:t>
       </w:r>
     </w:p>
     <w:p>
@@ -444,7 +444,7 @@
           <w:color w:val="262626"/>
           <w:sz w:val="19"/>
         </w:rPr>
-        <w:t xml:space="preserve">沟通表达与结构化反馈　</w:t>
+        <w:t xml:space="preserve">沟通、语言与合规　</w:t>
       </w:r>
       <w:r>
         <w:rPr>
@@ -453,7 +453,7 @@
           <w:color w:val="262626"/>
           <w:sz w:val="19"/>
         </w:rPr>
-        <w:t>高校市场营销专任教师，主讲四门课程；罗氏实习期间汇总专家反馈与市场信息输出月报，习惯将一线信息结构化反馈。英语可日常书面与口头沟通，粤语良好。</w:t>
+        <w:t>经外企与高校双重职业化训练，表达清晰，长期面向临床专家与学生讲解；英语可日常书面与口头沟通，粤语良好，普通话标准；学术活动与专家合作均在外企合规框架下策划执行，熟悉医疗推广的合规边界。</w:t>
       </w:r>
     </w:p>
     <w:p>
@@ -633,7 +633,7 @@
           <w:color w:val="262626"/>
           <w:sz w:val="19"/>
         </w:rPr>
-        <w:t>专家关系：持续拜访核心科室的临床专家与关键决策人，了解临床需求与关注点，建立长期稳定的合作关系。</w:t>
+        <w:t>专家开发与维护：梳理并持续拓展区域核心科室专家名单，定期拜访临床专家与关键决策人，响应专家日常需求，作为专家与公司之间的对接人，建立长期稳定的合作关系。</w:t>
       </w:r>
     </w:p>
     <w:p>
@@ -691,7 +691,7 @@
           <w:color w:val="262626"/>
           <w:sz w:val="19"/>
         </w:rPr>
-        <w:t>跨部门协作：配合市场部推进白皮书、手术指南编写及社交媒体科普项目在区域落地，协调专家参与。</w:t>
+        <w:t>反馈与协同：收集临床专家反馈并结构化反馈至市场部，配合推进白皮书、手术指南编写及社交媒体科普项目在区域落地，协调专家参与。</w:t>
       </w:r>
     </w:p>
     <w:p>
@@ -749,7 +749,7 @@
           <w:color w:val="262626"/>
           <w:sz w:val="19"/>
         </w:rPr>
-        <w:t>渠道与业绩：协助经销商制定行动计划并培训渠道人员，定期盘点渠道业绩；超额完成区域业绩指标。</w:t>
+        <w:t>合规与业绩：所有学术活动与专家合作均在公司合规准则框架下策划执行；协助经销商制定行动计划并培训渠道人员，超额完成区域业绩指标。</w:t>
       </w:r>
     </w:p>
     <w:p>
@@ -816,7 +816,7 @@
           <w:color w:val="262626"/>
           <w:sz w:val="19"/>
         </w:rPr>
-        <w:t>陌拜多家医院影像科，了解科室需求并传递产品价值；参加学术会议负责产品介绍。</w:t>
+        <w:t>陌拜多家医院影像科，了解科室需求并传递产品价值；围绕临床反馈提炼产品卖点，撰写产品宣传稿；参加学术会议负责产品介绍。</w:t>
       </w:r>
     </w:p>
     <w:p>
@@ -1391,7 +1391,7 @@
           <w:color w:val="262626"/>
           <w:sz w:val="19"/>
         </w:rPr>
-        <w:t>经管类专业出身，本科修读中药学、药理学等医药课程，硕士聚焦医药营销；从罗氏市场实习、强生一线销售到高校教学与医院渠道项目，学业与职业始终聚焦医疗与营销两个方向，工作围绕临床专家与医院客户展开。有跨境医疗项目经验，可接受为期一年的新加坡驻外，适应独立工作与结果导向的考核方式。</w:t>
+        <w:t>经管类专业出身，本科修读中药学、药理学等医药课程，硕士聚焦医药营销；从罗氏市场实习、强生一线销售到高校教学与医院渠道项目，学业与职业始终聚焦医疗与营销两个方向，工作围绕临床专家与医院客户展开。目标感与执行力强，在强生超额完成业绩指标，在渠道项目中从零开发 4 家医院；有跨境医疗项目经验，可接受为期一年的新加坡驻外，适应海外独立工作与结果导向的考核方式。</w:t>
       </w:r>
     </w:p>
     <w:sectPr>

</xml_diff>